<commit_message>
Updated mobile data functions and fixed some bugs in the mobile call functions
</commit_message>
<xml_diff>
--- a/doc/doc_draft.docx
+++ b/doc/doc_draft.docx
@@ -53,11 +53,15 @@
     <w:p>
       <w:pPr>
         <w:rPr>
-          <w:lang w:val="en-US"/>
-        </w:rPr>
-      </w:pPr>
-      <w:r>
-        <w:rPr>
+          <w:b/>
+          <w:bCs/>
+          <w:lang w:val="en-US"/>
+        </w:rPr>
+      </w:pPr>
+      <w:r>
+        <w:rPr>
+          <w:b/>
+          <w:bCs/>
           <w:lang w:val="en-US"/>
         </w:rPr>
         <w:t>Definition:</w:t>
@@ -66,23 +70,31 @@
     <w:p>
       <w:pPr>
         <w:rPr>
-          <w:lang w:val="en-US"/>
-        </w:rPr>
-      </w:pPr>
-      <w:r>
-        <w:rPr>
+          <w:b/>
+          <w:bCs/>
+          <w:lang w:val="en-US"/>
+        </w:rPr>
+      </w:pPr>
+      <w:r>
+        <w:rPr>
+          <w:b/>
+          <w:bCs/>
           <w:lang w:val="en-US"/>
         </w:rPr>
         <w:t xml:space="preserve">User </w:t>
       </w:r>
       <w:r>
         <w:rPr>
+          <w:b/>
+          <w:bCs/>
           <w:lang w:val="en-US"/>
         </w:rPr>
         <w:t>variables</w:t>
       </w:r>
       <w:r>
         <w:rPr>
+          <w:b/>
+          <w:bCs/>
           <w:lang w:val="en-US"/>
         </w:rPr>
         <w:t>:</w:t>
@@ -241,17 +253,35 @@
         <w:rPr>
           <w:lang w:val="en-US"/>
         </w:rPr>
-        <w:t xml:space="preserve"> headphones participant uses during calls (1 or 2)</w:t>
-      </w:r>
-    </w:p>
-    <w:p>
-      <w:pPr>
-        <w:rPr>
-          <w:lang w:val="en-US"/>
-        </w:rPr>
-      </w:pPr>
-      <w:r>
-        <w:rPr>
+        <w:t xml:space="preserve"> headphones </w:t>
+      </w:r>
+      <w:proofErr w:type="gramStart"/>
+      <w:r>
+        <w:rPr>
+          <w:lang w:val="en-US"/>
+        </w:rPr>
+        <w:t>participant uses</w:t>
+      </w:r>
+      <w:proofErr w:type="gramEnd"/>
+      <w:r>
+        <w:rPr>
+          <w:lang w:val="en-US"/>
+        </w:rPr>
+        <w:t xml:space="preserve"> during calls (1 or 2)</w:t>
+      </w:r>
+    </w:p>
+    <w:p>
+      <w:pPr>
+        <w:rPr>
+          <w:b/>
+          <w:bCs/>
+          <w:lang w:val="en-US"/>
+        </w:rPr>
+      </w:pPr>
+      <w:r>
+        <w:rPr>
+          <w:b/>
+          <w:bCs/>
           <w:lang w:val="en-US"/>
         </w:rPr>
         <w:t>Assumptions:</w:t>
@@ -356,7 +386,21 @@
         <w:rPr>
           <w:lang w:val="en-US"/>
         </w:rPr>
-        <w:t>While participant is NOT commuting, they spend their time in the following location:</w:t>
+        <w:t xml:space="preserve">While </w:t>
+      </w:r>
+      <w:proofErr w:type="gramStart"/>
+      <w:r>
+        <w:rPr>
+          <w:lang w:val="en-US"/>
+        </w:rPr>
+        <w:t>participant</w:t>
+      </w:r>
+      <w:proofErr w:type="gramEnd"/>
+      <w:r>
+        <w:rPr>
+          <w:lang w:val="en-US"/>
+        </w:rPr>
+        <w:t xml:space="preserve"> is NOT commuting, they spend their time in the following location:</w:t>
       </w:r>
     </w:p>
     <w:p>
@@ -432,6 +476,64 @@
     </w:p>
     <w:p>
       <w:pPr>
+        <w:rPr>
+          <w:b/>
+          <w:bCs/>
+          <w:lang w:val="en-US"/>
+        </w:rPr>
+      </w:pPr>
+      <w:r>
+        <w:rPr>
+          <w:b/>
+          <w:bCs/>
+          <w:lang w:val="en-US"/>
+        </w:rPr>
+        <w:t>Definition:</w:t>
+      </w:r>
+    </w:p>
+    <w:p>
+      <w:pPr>
+        <w:rPr>
+          <w:b/>
+          <w:bCs/>
+          <w:lang w:val="en-US"/>
+        </w:rPr>
+      </w:pPr>
+      <w:r>
+        <w:rPr>
+          <w:b/>
+          <w:bCs/>
+          <w:lang w:val="en-US"/>
+        </w:rPr>
+        <w:t>User variables:</w:t>
+      </w:r>
+    </w:p>
+    <w:p>
+      <w:pPr>
+        <w:rPr>
+          <w:b/>
+          <w:bCs/>
+          <w:lang w:val="en-US"/>
+        </w:rPr>
+      </w:pPr>
+      <w:r>
+        <w:rPr>
+          <w:b/>
+          <w:bCs/>
+          <w:lang w:val="en-US"/>
+        </w:rPr>
+        <w:t>Assumptions:</w:t>
+      </w:r>
+    </w:p>
+    <w:p>
+      <w:pPr>
+        <w:rPr>
+          <w:lang w:val="en-US"/>
+        </w:rPr>
+      </w:pPr>
+    </w:p>
+    <w:p>
+      <w:pPr>
         <w:pStyle w:val="Heading3"/>
         <w:rPr>
           <w:lang w:val="en-US"/>
@@ -441,20 +543,15 @@
         <w:rPr>
           <w:lang w:val="en-US"/>
         </w:rPr>
-        <w:t xml:space="preserve">WiFi </w:t>
-      </w:r>
-      <w:r>
-        <w:rPr>
-          <w:lang w:val="en-US"/>
-        </w:rPr>
-        <w:t>r</w:t>
-      </w:r>
-      <w:r>
-        <w:rPr>
-          <w:lang w:val="en-US"/>
-        </w:rPr>
-        <w:t>outer</w:t>
-      </w:r>
+        <w:t>Far-Field</w:t>
+      </w:r>
+    </w:p>
+    <w:p>
+      <w:pPr>
+        <w:rPr>
+          <w:lang w:val="en-US"/>
+        </w:rPr>
+      </w:pPr>
     </w:p>
     <w:p>
       <w:pPr>
@@ -467,8 +564,15 @@
         <w:rPr>
           <w:lang w:val="en-US"/>
         </w:rPr>
-        <w:t>Far-Field</w:t>
-      </w:r>
+        <w:t>WiFi router</w:t>
+      </w:r>
+    </w:p>
+    <w:p>
+      <w:pPr>
+        <w:rPr>
+          <w:lang w:val="en-US"/>
+        </w:rPr>
+      </w:pPr>
     </w:p>
     <w:p>
       <w:pPr>
@@ -495,6 +599,7 @@
         <w:rPr>
           <w:lang w:val="en-US"/>
         </w:rPr>
+        <w:lastRenderedPageBreak/>
         <w:t>Laptop</w:t>
       </w:r>
     </w:p>
@@ -533,12 +638,6 @@
           <w:lang w:val="en-US"/>
         </w:rPr>
       </w:pPr>
-      <w:r>
-        <w:rPr>
-          <w:lang w:val="en-US"/>
-        </w:rPr>
-        <w:t>Total dose</w:t>
-      </w:r>
     </w:p>
     <w:sectPr>
       <w:pgSz w:w="11906" w:h="16838"/>

</xml_diff>